<commit_message>
Extract ownership proof block into manual data
</commit_message>
<xml_diff>
--- a/templates/notarial-act-template-v1.docx
+++ b/templates/notarial-act-template-v1.docx
@@ -1830,188 +1830,12 @@
             </w:r>
             <w:r>
               <w:rPr>
-                <w:rFonts w:ascii="Georgia" w:hAnsi="Georgia"/>
-                <w:i/>
-                <w:sz w:val="21"/>
-                <w:szCs w:val="21"/>
-                <w:lang w:val="bg-BG"/>
-              </w:rPr>
-              <w:t xml:space="preserve">представляващ съгласно доказателствен </w:t>
-            </w:r>
-            <w:r>
-              <w:rPr>
-                <w:rFonts w:ascii="Georgia" w:hAnsi="Georgia"/>
-                <w:i/>
-                <w:sz w:val="21"/>
-                <w:szCs w:val="21"/>
-                <w:lang w:val="bg-BG"/>
-              </w:rPr>
-              <w:t>Н</w:t>
-            </w:r>
-            <w:r>
-              <w:rPr>
-                <w:rFonts w:ascii="Georgia" w:hAnsi="Georgia"/>
-                <w:i/>
-                <w:sz w:val="21"/>
-                <w:szCs w:val="21"/>
-                <w:lang w:val="bg-BG"/>
-              </w:rPr>
-              <w:t>отариален акт за покупко-продажба на недвижим имот, № 29, том 2, рег. № 3118, дело 179 от 17.06.2005г. на Нотариус Маргарита Перусанова, рег. № 236 в НК, с район на действие – РС – София, вписан в СВ – гр. София към АВ с вх. рег. 29484 от 17.06.2005г., Акт № 183, том 85, дело № 21635/2005г., по имотна партида № 311618</w:t>
-            </w:r>
-            <w:r>
-              <w:rPr>
-                <w:rFonts w:ascii="Georgia" w:hAnsi="Georgia"/>
-                <w:sz w:val="21"/>
-                <w:szCs w:val="21"/>
-                <w:lang w:val="bg-BG"/>
-              </w:rPr>
-              <w:t xml:space="preserve"> –</w:t>
-            </w:r>
-            <w:r>
-              <w:rPr>
-                <w:rFonts w:ascii="Georgia" w:hAnsi="Georgia"/>
-                <w:sz w:val="21"/>
-                <w:szCs w:val="21"/>
-                <w:lang w:val="bg-BG"/>
-              </w:rPr>
-              <w:t xml:space="preserve"> </w:t>
-            </w:r>
-            <w:r>
-              <w:rPr>
-                <w:rFonts w:ascii="Georgia" w:hAnsi="Georgia"/>
-                <w:b/>
-                <w:bCs/>
-                <w:sz w:val="21"/>
-                <w:szCs w:val="21"/>
-                <w:lang w:val="bg-BG"/>
-              </w:rPr>
-              <w:t>АПАРТАМЕНТ № 6</w:t>
-            </w:r>
-            <w:r>
-              <w:rPr>
-                <w:rFonts w:ascii="Georgia" w:hAnsi="Georgia"/>
-                <w:sz w:val="21"/>
-                <w:szCs w:val="21"/>
-                <w:lang w:val="bg-BG"/>
-              </w:rPr>
-              <w:t xml:space="preserve"> /</w:t>
-            </w:r>
-            <w:r>
-              <w:rPr>
-                <w:rFonts w:ascii="Georgia" w:hAnsi="Georgia"/>
-                <w:b/>
-                <w:bCs/>
-                <w:sz w:val="21"/>
-                <w:szCs w:val="21"/>
-                <w:lang w:val="bg-BG"/>
-              </w:rPr>
-              <w:t>шест</w:t>
-            </w:r>
-            <w:r>
-              <w:rPr>
-                <w:rFonts w:ascii="Georgia" w:hAnsi="Georgia"/>
-                <w:sz w:val="21"/>
-                <w:szCs w:val="21"/>
-                <w:lang w:val="bg-BG"/>
-              </w:rPr>
-              <w:t xml:space="preserve">/, находящ се в град София, в сградата на Е. С. „Попилиеви“, на ул. „Цар Иван Асен II /втори/“ № 43 /четиридесет и три/, с площ от 80 /осемдесет/ кв. м., състоящ се от две стаи, хол, кухня и сервизни помещения, при съседи: изток – апартамент № 5 /пет/ на Радко Димитров Попилиев и стълбище, север – дворно място, запад – дворно място, юг – улица „Цар Иван Асен II /втори/“, </w:t>
-            </w:r>
-            <w:r>
-              <w:rPr>
-                <w:rFonts w:ascii="Georgia" w:hAnsi="Georgia"/>
-                <w:b/>
-                <w:sz w:val="21"/>
-                <w:szCs w:val="21"/>
-                <w:lang w:val="bg-BG"/>
-              </w:rPr>
-              <w:t>заедно с ТАВАНСКО ПОМЕЩЕНИЕ</w:t>
-            </w:r>
-            <w:r>
-              <w:rPr>
-                <w:rFonts w:ascii="Georgia" w:hAnsi="Georgia"/>
-                <w:sz w:val="21"/>
-                <w:szCs w:val="21"/>
-                <w:lang w:val="bg-BG"/>
-              </w:rPr>
-              <w:t xml:space="preserve"> </w:t>
-            </w:r>
-            <w:r>
-              <w:rPr>
-                <w:rFonts w:ascii="Georgia" w:hAnsi="Georgia"/>
-                <w:b/>
-                <w:bCs/>
-                <w:sz w:val="21"/>
-                <w:szCs w:val="21"/>
-                <w:lang w:val="bg-BG"/>
-              </w:rPr>
-              <w:t>№ 6</w:t>
-            </w:r>
-            <w:r>
-              <w:rPr>
-                <w:rFonts w:ascii="Georgia" w:hAnsi="Georgia"/>
-                <w:sz w:val="21"/>
-                <w:szCs w:val="21"/>
-                <w:lang w:val="bg-BG"/>
-              </w:rPr>
-              <w:t xml:space="preserve"> /шест/, без описана квадратура по доказателствен нотариален акт, при съседи: изток – таванско помещение № 7 /седем/ на Мая Аврамова Лисичкова и коридор, север – коридор, запад – таванско помещение № 5 /пет/ на Роза Костова Илиева и коридор, </w:t>
-            </w:r>
-            <w:r>
-              <w:rPr>
-                <w:rFonts w:ascii="Georgia" w:hAnsi="Georgia"/>
-                <w:b/>
-                <w:sz w:val="21"/>
-                <w:szCs w:val="21"/>
-                <w:lang w:val="bg-BG"/>
-              </w:rPr>
-              <w:t>заедно с ИЗБЕНО ПОМЕЩЕНИЕ № 6</w:t>
-            </w:r>
-            <w:r>
-              <w:rPr>
-                <w:rFonts w:ascii="Georgia" w:hAnsi="Georgia"/>
-                <w:sz w:val="21"/>
-                <w:szCs w:val="21"/>
-                <w:lang w:val="bg-BG"/>
-              </w:rPr>
-              <w:t xml:space="preserve"> /шест/, без описана квадратура по доказателствен нотариален акт, при съседи: изток – коридор, север – избено помещение № 7 /седем/ на Мария Георгиева Дончева, запад – коридор, юг – улица „Цар Иван Асен II /втори/“, </w:t>
-            </w:r>
-            <w:r>
-              <w:rPr>
-                <w:rFonts w:ascii="Georgia" w:hAnsi="Georgia"/>
-                <w:b/>
-                <w:sz w:val="21"/>
-                <w:szCs w:val="21"/>
-                <w:lang w:val="bg-BG"/>
-              </w:rPr>
-              <w:t>заедно с 12,51 % /дванадесет цяло петдесет и една стотни</w:t>
-            </w:r>
-            <w:r>
-              <w:rPr>
-                <w:rFonts w:ascii="Georgia" w:hAnsi="Georgia"/>
-                <w:b/>
-                <w:sz w:val="21"/>
-                <w:szCs w:val="21"/>
-                <w:lang w:val="bg-BG"/>
-              </w:rPr>
-              <w:t xml:space="preserve"> върху сто</w:t>
-            </w:r>
-            <w:r>
-              <w:rPr>
-                <w:rFonts w:ascii="Georgia" w:hAnsi="Georgia"/>
-                <w:b/>
-                <w:sz w:val="21"/>
-                <w:szCs w:val="21"/>
-                <w:lang w:val="bg-BG"/>
-              </w:rPr>
-              <w:t>/ идеални части от общите части на сградата и от правото на строеж върху мястото</w:t>
-            </w:r>
-            <w:r>
-              <w:rPr>
-                <w:rFonts w:ascii="Georgia" w:hAnsi="Georgia"/>
-                <w:sz w:val="21"/>
-                <w:szCs w:val="21"/>
-                <w:lang w:val="bg-BG"/>
-              </w:rPr>
-              <w:t>, в което е построена сградата, с площ от 263,50 /двеста шестдесет и три цяло и петдесет стотни/ кв. м., съставляващо имот планоснимачен номер 13 /тринадесет/, в квартал 23 /двадесет и три/ по плана на град София, местност „Трета извънградска част“</w:t>
+                <w:rFonts w:ascii="Georgia" w:eastAsia="Calibri" w:hAnsi="Georgia"/>
+                <w:sz w:val="21"/>
+                <w:szCs w:val="21"/>
+                <w:lang w:eastAsia="bg-BG"/>
+              </w:rPr>
+              <w:t>{{ownership_proof_text}}</w:t>
             </w:r>
             <w:r>
               <w:rPr>
@@ -2469,17 +2293,7 @@
                 <w:szCs w:val="21"/>
                 <w:lang w:val="bg-BG" w:eastAsia="bg-BG"/>
               </w:rPr>
-              <w:t xml:space="preserve">продажна цена, като към </w:t>
-            </w:r>
-            <w:r>
-              <w:rPr>
-                <w:rFonts w:ascii="Georgia" w:hAnsi="Georgia" w:cs="Courier New"/>
-                <w:sz w:val="21"/>
-                <w:szCs w:val="21"/>
-                <w:lang w:val="bg-BG" w:eastAsia="bg-BG"/>
-              </w:rPr>
-              <w:lastRenderedPageBreak/>
-              <w:t xml:space="preserve">датата на подписване на настоящия окончателен договор във формата на нотариален акт дължимата сума от общата продажна цена е в размер на </w:t>
+              <w:t xml:space="preserve">продажна цена, като към датата на подписване на настоящия окончателен договор във формата на нотариален акт дължимата сума от общата продажна цена е в размер на </w:t>
             </w:r>
             <w:r>
               <w:rPr>
@@ -3646,7 +3460,17 @@
                 <w:szCs w:val="21"/>
                 <w:lang w:val="bg-BG" w:eastAsia="bg-BG"/>
               </w:rPr>
-              <w:t xml:space="preserve"> няма сключени предварителни договори за продажба с трети лица, не </w:t>
+              <w:t xml:space="preserve"> няма сключени предварителни договори за продажба с трети </w:t>
+            </w:r>
+            <w:r>
+              <w:rPr>
+                <w:rFonts w:ascii="Georgia" w:hAnsi="Georgia"/>
+                <w:sz w:val="21"/>
+                <w:szCs w:val="21"/>
+                <w:lang w:val="bg-BG" w:eastAsia="bg-BG"/>
+              </w:rPr>
+              <w:lastRenderedPageBreak/>
+              <w:t xml:space="preserve">лица, не </w:t>
             </w:r>
             <w:r>
               <w:rPr>
@@ -5167,17 +4991,7 @@
                 <w:szCs w:val="21"/>
                 <w:lang w:val="bg-BG" w:eastAsia="bg-BG"/>
               </w:rPr>
-              <w:t xml:space="preserve">Преди извършването и подписването на нотариалния акт, в изпълнение на задълженията </w:t>
-            </w:r>
-            <w:r>
-              <w:rPr>
-                <w:rFonts w:ascii="Georgia" w:hAnsi="Georgia"/>
-                <w:sz w:val="21"/>
-                <w:szCs w:val="21"/>
-                <w:lang w:val="bg-BG" w:eastAsia="bg-BG"/>
-              </w:rPr>
-              <w:lastRenderedPageBreak/>
-              <w:t xml:space="preserve">си по </w:t>
+              <w:t xml:space="preserve">Преди извършването и подписването на нотариалния акт, в изпълнение на задълженията си по </w:t>
             </w:r>
             <w:r>
               <w:rPr>
@@ -5525,7 +5339,17 @@
                 <w:szCs w:val="21"/>
                 <w:lang w:val="bg-BG" w:eastAsia="bg-BG"/>
               </w:rPr>
-              <w:t>РСЦ24-УГ01-4783/30.07.2024 г., издадено от Столична община-район „Средец“</w:t>
+              <w:t>РСЦ24-УГ01-</w:t>
+            </w:r>
+            <w:r>
+              <w:rPr>
+                <w:rFonts w:ascii="Georgia" w:hAnsi="Georgia"/>
+                <w:sz w:val="21"/>
+                <w:szCs w:val="21"/>
+                <w:lang w:val="bg-BG" w:eastAsia="bg-BG"/>
+              </w:rPr>
+              <w:lastRenderedPageBreak/>
+              <w:t>4783/30.07.2024 г., издадено от Столична община-район „Средец“</w:t>
             </w:r>
             <w:r>
               <w:rPr>
@@ -7285,7 +7109,6 @@
   <w:style w:type="character" w:default="1" w:styleId="DefaultParagraphFont">
     <w:name w:val="Default Paragraph Font"/>
     <w:uiPriority w:val="1"/>
-    <w:semiHidden/>
     <w:unhideWhenUsed/>
   </w:style>
   <w:style w:type="table" w:default="1" w:styleId="TableNormal">

</xml_diff>

<commit_message>
Move presented documents list to manual data
</commit_message>
<xml_diff>
--- a/templates/notarial-act-template-v1.docx
+++ b/templates/notarial-act-template-v1.docx
@@ -5020,695 +5020,18 @@
                 <w:b/>
                 <w:sz w:val="21"/>
                 <w:szCs w:val="21"/>
-                <w:lang w:val="bg-BG" w:eastAsia="bg-BG"/>
-              </w:rPr>
-              <w:t xml:space="preserve">1. </w:t>
-            </w:r>
-            <w:r>
-              <w:rPr>
-                <w:rFonts w:ascii="Georgia" w:hAnsi="Georgia"/>
-                <w:sz w:val="21"/>
-                <w:szCs w:val="21"/>
-                <w:lang w:val="bg-BG" w:eastAsia="bg-BG"/>
-              </w:rPr>
-              <w:t>Нотариален акт за покупко-продажба на недвижим имот, № 29, том 2, рег. № 3118, дело 179 от 17.06.2005г. на Нотариус Маргарита Перусанова, рег. № 236 в НК, с район на действие – РС – София, вписан в СВ – гр. София към АВ с вх. рег. 29484 от 17.06.2005г., Акт № 183, том 85, дело № 21635/2005г., по имотна партида № 311618</w:t>
-            </w:r>
-            <w:r>
-              <w:rPr>
-                <w:rFonts w:ascii="Georgia" w:hAnsi="Georgia"/>
-                <w:sz w:val="21"/>
-                <w:szCs w:val="21"/>
-                <w:lang w:val="bg-BG" w:eastAsia="bg-BG"/>
-              </w:rPr>
-              <w:t xml:space="preserve">; </w:t>
-            </w:r>
-            <w:r>
-              <w:rPr>
-                <w:rFonts w:ascii="Georgia" w:hAnsi="Georgia"/>
-                <w:b/>
-                <w:sz w:val="21"/>
-                <w:szCs w:val="21"/>
-                <w:lang w:val="bg-BG" w:eastAsia="bg-BG"/>
-              </w:rPr>
-              <w:t xml:space="preserve">2. </w:t>
-            </w:r>
-            <w:r>
-              <w:rPr>
-                <w:rFonts w:ascii="Georgia" w:hAnsi="Georgia"/>
-                <w:sz w:val="21"/>
-                <w:szCs w:val="21"/>
-                <w:lang w:val="bg-BG" w:eastAsia="bg-BG"/>
-              </w:rPr>
-              <w:t>Схема на самостоятелен обект в сграда № 15-212416-12.02.2026 г., издадена от АГКК</w:t>
-            </w:r>
-            <w:r>
-              <w:rPr>
-                <w:rFonts w:ascii="Georgia" w:hAnsi="Georgia"/>
-                <w:sz w:val="21"/>
-                <w:szCs w:val="21"/>
-                <w:lang w:val="bg-BG" w:eastAsia="bg-BG"/>
-              </w:rPr>
-              <w:t>;</w:t>
-            </w:r>
-            <w:r>
-              <w:rPr>
-                <w:rFonts w:ascii="Georgia" w:hAnsi="Georgia"/>
-                <w:sz w:val="21"/>
-                <w:szCs w:val="21"/>
-                <w:lang w:val="bg-BG" w:eastAsia="bg-BG"/>
-              </w:rPr>
-              <w:t xml:space="preserve"> </w:t>
-            </w:r>
-            <w:r>
-              <w:rPr>
-                <w:rFonts w:ascii="Georgia" w:hAnsi="Georgia"/>
-                <w:b/>
-                <w:sz w:val="21"/>
-                <w:szCs w:val="21"/>
-                <w:lang w:val="bg-BG" w:eastAsia="bg-BG"/>
-              </w:rPr>
-              <w:t>3</w:t>
-            </w:r>
-            <w:r>
-              <w:rPr>
-                <w:rFonts w:ascii="Georgia" w:hAnsi="Georgia"/>
-                <w:b/>
-                <w:sz w:val="21"/>
-                <w:szCs w:val="21"/>
-                <w:lang w:val="bg-BG" w:eastAsia="bg-BG"/>
-              </w:rPr>
-              <w:t>.</w:t>
-            </w:r>
-            <w:r>
-              <w:rPr>
-                <w:rFonts w:ascii="Georgia" w:hAnsi="Georgia"/>
-                <w:sz w:val="21"/>
-                <w:szCs w:val="21"/>
-                <w:lang w:val="bg-BG" w:eastAsia="bg-BG"/>
-              </w:rPr>
-              <w:t xml:space="preserve"> </w:t>
-            </w:r>
-            <w:r>
-              <w:rPr>
-                <w:rFonts w:ascii="Georgia" w:hAnsi="Georgia"/>
-                <w:sz w:val="21"/>
-                <w:szCs w:val="21"/>
-                <w:lang w:val="bg-BG" w:eastAsia="bg-BG"/>
-              </w:rPr>
-              <w:t xml:space="preserve">Удостоверение за данъчна оценка с изх. № 7224051164, издадено на </w:t>
-            </w:r>
-            <w:r>
-              <w:rPr>
-                <w:rFonts w:ascii="Georgia" w:hAnsi="Georgia"/>
-                <w:sz w:val="21"/>
-                <w:szCs w:val="21"/>
-                <w:lang w:val="bg-BG" w:eastAsia="bg-BG"/>
-              </w:rPr>
-              <w:lastRenderedPageBreak/>
-              <w:t>25.03.2026 г. от Столична община, Дирекция „Общински приходи“, Отдел ОП „Средец – Триадица“</w:t>
-            </w:r>
-            <w:r>
-              <w:rPr>
-                <w:rFonts w:ascii="Georgia" w:hAnsi="Georgia"/>
-                <w:sz w:val="21"/>
-                <w:szCs w:val="21"/>
-                <w:lang w:val="bg-BG" w:eastAsia="bg-BG"/>
-              </w:rPr>
-              <w:t xml:space="preserve">; </w:t>
-            </w:r>
-            <w:r>
-              <w:rPr>
-                <w:rFonts w:ascii="Georgia" w:hAnsi="Georgia"/>
-                <w:b/>
-                <w:sz w:val="21"/>
-                <w:szCs w:val="21"/>
-                <w:lang w:val="bg-BG" w:eastAsia="bg-BG"/>
-              </w:rPr>
-              <w:t>4</w:t>
-            </w:r>
-            <w:r>
-              <w:rPr>
-                <w:rFonts w:ascii="Georgia" w:hAnsi="Georgia"/>
-                <w:b/>
-                <w:sz w:val="21"/>
-                <w:szCs w:val="21"/>
-                <w:lang w:val="bg-BG" w:eastAsia="bg-BG"/>
-              </w:rPr>
-              <w:t>.</w:t>
-            </w:r>
-            <w:r>
-              <w:rPr>
-                <w:rFonts w:ascii="Georgia" w:hAnsi="Georgia"/>
-                <w:b/>
-                <w:sz w:val="21"/>
-                <w:szCs w:val="21"/>
-                <w:lang w:val="bg-BG" w:eastAsia="bg-BG"/>
-              </w:rPr>
-              <w:t xml:space="preserve"> </w:t>
-            </w:r>
-            <w:r>
-              <w:rPr>
-                <w:rFonts w:ascii="Georgia" w:hAnsi="Georgia"/>
-                <w:sz w:val="21"/>
-                <w:szCs w:val="21"/>
-                <w:lang w:val="bg-BG" w:eastAsia="bg-BG"/>
-              </w:rPr>
-              <w:t xml:space="preserve">Удостоверение за семейно положение, съпруг/а и деца изх. № </w:t>
-            </w:r>
-            <w:r>
-              <w:rPr>
-                <w:rFonts w:ascii="Georgia" w:hAnsi="Georgia"/>
-                <w:sz w:val="21"/>
-                <w:szCs w:val="21"/>
-                <w:lang w:val="bg-BG" w:eastAsia="bg-BG"/>
-              </w:rPr>
-              <w:t>РСЦ24-УГ01-4783/30.07.2024 г., издадено от Столична община-район „Средец“</w:t>
-            </w:r>
-            <w:r>
-              <w:rPr>
-                <w:rFonts w:ascii="Georgia" w:hAnsi="Georgia"/>
-                <w:sz w:val="21"/>
-                <w:szCs w:val="21"/>
-                <w:lang w:val="bg-BG" w:eastAsia="bg-BG"/>
-              </w:rPr>
-              <w:t xml:space="preserve">; </w:t>
-            </w:r>
-            <w:r>
-              <w:rPr>
-                <w:rFonts w:ascii="Georgia" w:hAnsi="Georgia"/>
-                <w:b/>
-                <w:sz w:val="21"/>
-                <w:szCs w:val="21"/>
-                <w:lang w:val="bg-BG" w:eastAsia="bg-BG"/>
-              </w:rPr>
-              <w:t>5</w:t>
-            </w:r>
-            <w:r>
-              <w:rPr>
-                <w:rFonts w:ascii="Georgia" w:hAnsi="Georgia"/>
-                <w:b/>
-                <w:sz w:val="21"/>
-                <w:szCs w:val="21"/>
-                <w:lang w:val="bg-BG" w:eastAsia="bg-BG"/>
-              </w:rPr>
-              <w:t>.</w:t>
-            </w:r>
-            <w:r>
-              <w:rPr>
-                <w:rFonts w:ascii="Georgia" w:hAnsi="Georgia"/>
-                <w:b/>
-                <w:sz w:val="21"/>
-                <w:szCs w:val="21"/>
-                <w:lang w:val="bg-BG" w:eastAsia="bg-BG"/>
-              </w:rPr>
-              <w:t xml:space="preserve"> </w:t>
-            </w:r>
-            <w:r>
-              <w:rPr>
-                <w:rFonts w:ascii="Georgia" w:hAnsi="Georgia"/>
-                <w:sz w:val="21"/>
-                <w:szCs w:val="21"/>
-                <w:lang w:val="bg-BG" w:eastAsia="bg-BG"/>
-              </w:rPr>
-              <w:t>Удостоверение за идентичност на лице с различни имена изх. № РСЦ24-УГ01-4783/30.07.2024 г., издадено от Столична община-район „Средец“</w:t>
-            </w:r>
-            <w:r>
-              <w:rPr>
-                <w:rFonts w:ascii="Georgia" w:hAnsi="Georgia"/>
-                <w:sz w:val="21"/>
-                <w:szCs w:val="21"/>
-                <w:lang w:val="bg-BG" w:eastAsia="bg-BG"/>
-              </w:rPr>
-              <w:t xml:space="preserve">; </w:t>
-            </w:r>
-            <w:r>
-              <w:rPr>
-                <w:rFonts w:ascii="Georgia" w:hAnsi="Georgia"/>
-                <w:b/>
-                <w:sz w:val="21"/>
-                <w:szCs w:val="21"/>
-                <w:lang w:val="bg-BG" w:eastAsia="bg-BG"/>
-              </w:rPr>
-              <w:t>6</w:t>
-            </w:r>
-            <w:r>
-              <w:rPr>
-                <w:rFonts w:ascii="Georgia" w:hAnsi="Georgia"/>
-                <w:b/>
-                <w:sz w:val="21"/>
-                <w:szCs w:val="21"/>
-                <w:lang w:val="bg-BG" w:eastAsia="bg-BG"/>
-              </w:rPr>
-              <w:t>.</w:t>
-            </w:r>
-            <w:r>
-              <w:rPr>
-                <w:rFonts w:ascii="Georgia" w:hAnsi="Georgia"/>
-                <w:b/>
-                <w:sz w:val="21"/>
-                <w:szCs w:val="21"/>
-                <w:lang w:val="bg-BG" w:eastAsia="bg-BG"/>
-              </w:rPr>
-              <w:t xml:space="preserve"> </w:t>
-            </w:r>
-            <w:r>
-              <w:rPr>
-                <w:rFonts w:ascii="Georgia" w:hAnsi="Georgia"/>
-                <w:sz w:val="21"/>
-                <w:szCs w:val="21"/>
-                <w:lang w:val="bg-BG" w:eastAsia="bg-BG"/>
-              </w:rPr>
-              <w:t>Решение от 24.10.2000 г. на СРС, Брачна колегия, 83 състав, постановено по гр. дело № 725 от 2000 година</w:t>
-            </w:r>
-            <w:r>
-              <w:rPr>
-                <w:rFonts w:ascii="Georgia" w:hAnsi="Georgia"/>
-                <w:sz w:val="21"/>
-                <w:szCs w:val="21"/>
-                <w:lang w:val="bg-BG" w:eastAsia="bg-BG"/>
-              </w:rPr>
-              <w:t xml:space="preserve">; </w:t>
-            </w:r>
-            <w:r>
-              <w:rPr>
-                <w:rFonts w:ascii="Georgia" w:hAnsi="Georgia"/>
-                <w:b/>
-                <w:sz w:val="21"/>
-                <w:szCs w:val="21"/>
-                <w:lang w:val="bg-BG" w:eastAsia="bg-BG"/>
-              </w:rPr>
-              <w:t>7</w:t>
-            </w:r>
-            <w:r>
-              <w:rPr>
-                <w:rFonts w:ascii="Georgia" w:hAnsi="Georgia"/>
-                <w:b/>
-                <w:sz w:val="21"/>
-                <w:szCs w:val="21"/>
-                <w:lang w:val="bg-BG" w:eastAsia="bg-BG"/>
-              </w:rPr>
-              <w:t>.</w:t>
-            </w:r>
-            <w:r>
-              <w:rPr>
-                <w:rFonts w:ascii="Georgia" w:hAnsi="Georgia"/>
-                <w:b/>
-                <w:sz w:val="21"/>
-                <w:szCs w:val="21"/>
-                <w:lang w:val="bg-BG" w:eastAsia="bg-BG"/>
-              </w:rPr>
-              <w:t xml:space="preserve"> </w:t>
-            </w:r>
-            <w:r>
-              <w:rPr>
-                <w:rFonts w:ascii="Georgia" w:hAnsi="Georgia"/>
-                <w:sz w:val="21"/>
-                <w:szCs w:val="21"/>
-                <w:lang w:val="bg-BG" w:eastAsia="bg-BG"/>
-              </w:rPr>
-              <w:t xml:space="preserve">Брачен договор от 11.11.2019 г., с нотариална заверка на подписи и съдържание от 11.11.2019 г., вписан в Служба по вписванията – гр. София с вх. рег. № 74329/11.11.2019 г., акт № 77, том </w:t>
-            </w:r>
-            <w:r>
-              <w:rPr>
-                <w:rFonts w:ascii="Georgia" w:hAnsi="Georgia"/>
-                <w:sz w:val="21"/>
-                <w:szCs w:val="21"/>
-                <w:lang w:val="en-US" w:eastAsia="bg-BG"/>
-              </w:rPr>
-              <w:t>XIV</w:t>
-            </w:r>
-            <w:r>
-              <w:rPr>
-                <w:rFonts w:ascii="Georgia" w:hAnsi="Georgia"/>
-                <w:sz w:val="21"/>
-                <w:szCs w:val="21"/>
-                <w:lang w:val="bg-BG" w:eastAsia="bg-BG"/>
-              </w:rPr>
-              <w:t xml:space="preserve">; </w:t>
-            </w:r>
-            <w:r>
-              <w:rPr>
-                <w:rFonts w:ascii="Georgia" w:hAnsi="Georgia"/>
-                <w:b/>
-                <w:sz w:val="21"/>
-                <w:szCs w:val="21"/>
-                <w:lang w:val="bg-BG" w:eastAsia="bg-BG"/>
-              </w:rPr>
-              <w:t>8</w:t>
-            </w:r>
-            <w:r>
-              <w:rPr>
-                <w:rFonts w:ascii="Georgia" w:hAnsi="Georgia"/>
-                <w:b/>
-                <w:sz w:val="21"/>
-                <w:szCs w:val="21"/>
-                <w:lang w:val="bg-BG" w:eastAsia="bg-BG"/>
-              </w:rPr>
-              <w:t>.</w:t>
-            </w:r>
-            <w:r>
-              <w:rPr>
-                <w:rFonts w:ascii="Georgia" w:hAnsi="Georgia"/>
-                <w:sz w:val="21"/>
-                <w:szCs w:val="21"/>
-                <w:lang w:val="bg-BG" w:eastAsia="bg-BG"/>
-              </w:rPr>
-              <w:t xml:space="preserve"> Удостоверение за режим на имуществени отношения на Продавача с изх. № 20210721133355/дата 21.07.2021 г.</w:t>
-            </w:r>
-            <w:r>
-              <w:rPr>
-                <w:rFonts w:ascii="Georgia" w:hAnsi="Georgia"/>
-                <w:sz w:val="21"/>
-                <w:szCs w:val="21"/>
-                <w:lang w:val="bg-BG" w:eastAsia="bg-BG"/>
-              </w:rPr>
-              <w:t xml:space="preserve">; </w:t>
-            </w:r>
-            <w:r>
-              <w:rPr>
-                <w:rFonts w:ascii="Georgia" w:hAnsi="Georgia"/>
-                <w:b/>
-                <w:sz w:val="21"/>
-                <w:szCs w:val="21"/>
-                <w:lang w:val="bg-BG" w:eastAsia="bg-BG"/>
-              </w:rPr>
-              <w:t xml:space="preserve">9. </w:t>
-            </w:r>
-            <w:r>
-              <w:rPr>
-                <w:rFonts w:ascii="Georgia" w:hAnsi="Georgia"/>
-                <w:sz w:val="21"/>
-                <w:szCs w:val="21"/>
-                <w:lang w:val="bg-BG" w:eastAsia="bg-BG"/>
-              </w:rPr>
-              <w:t xml:space="preserve">Удостоверение за вписвания, отбелязвания и заличавания за имот на основание чл. 45, б. „б“ и „в“ от Правилника за вписванията изх. № </w:t>
-            </w:r>
-            <w:r>
-              <w:rPr>
-                <w:rFonts w:ascii="Georgia" w:hAnsi="Georgia"/>
-                <w:sz w:val="21"/>
-                <w:szCs w:val="21"/>
-                <w:lang w:val="en-US" w:eastAsia="bg-BG"/>
-              </w:rPr>
-              <w:t xml:space="preserve">______ </w:t>
-            </w:r>
-            <w:r>
-              <w:rPr>
-                <w:rFonts w:ascii="Georgia" w:hAnsi="Georgia"/>
-                <w:sz w:val="21"/>
-                <w:szCs w:val="21"/>
-                <w:lang w:val="bg-BG" w:eastAsia="bg-BG"/>
-              </w:rPr>
-              <w:t xml:space="preserve">от </w:t>
-            </w:r>
-            <w:r>
-              <w:rPr>
-                <w:rFonts w:ascii="Georgia" w:hAnsi="Georgia"/>
-                <w:sz w:val="21"/>
-                <w:szCs w:val="21"/>
-                <w:lang w:val="en-US" w:eastAsia="bg-BG"/>
-              </w:rPr>
-              <w:t xml:space="preserve">_______ 2026 </w:t>
-            </w:r>
-            <w:r>
-              <w:rPr>
-                <w:rFonts w:ascii="Georgia" w:hAnsi="Georgia"/>
-                <w:sz w:val="21"/>
-                <w:szCs w:val="21"/>
-                <w:lang w:val="bg-BG" w:eastAsia="bg-BG"/>
-              </w:rPr>
-              <w:t xml:space="preserve">година; </w:t>
-            </w:r>
-            <w:r>
-              <w:rPr>
-                <w:rFonts w:ascii="Georgia" w:hAnsi="Georgia"/>
-                <w:b/>
-                <w:sz w:val="21"/>
-                <w:szCs w:val="21"/>
-                <w:lang w:val="bg-BG" w:eastAsia="bg-BG"/>
-              </w:rPr>
-              <w:t>10</w:t>
-            </w:r>
-            <w:r>
-              <w:rPr>
-                <w:rFonts w:ascii="Georgia" w:hAnsi="Georgia" w:cs="Courier New"/>
-                <w:b/>
-                <w:sz w:val="21"/>
-                <w:szCs w:val="21"/>
-                <w:lang w:val="bg-BG" w:eastAsia="bg-BG"/>
-              </w:rPr>
-              <w:t>.</w:t>
-            </w:r>
-            <w:r>
-              <w:rPr>
-                <w:rFonts w:ascii="Georgia" w:hAnsi="Georgia" w:cs="Courier New"/>
-                <w:sz w:val="21"/>
-                <w:szCs w:val="21"/>
-                <w:lang w:val="bg-BG" w:eastAsia="bg-BG"/>
-              </w:rPr>
-              <w:t xml:space="preserve"> </w:t>
-            </w:r>
-            <w:r>
-              <w:rPr>
-                <w:rFonts w:ascii="Georgia" w:hAnsi="Georgia"/>
-                <w:sz w:val="21"/>
-                <w:szCs w:val="21"/>
-                <w:lang w:val="bg-BG" w:eastAsia="bg-BG"/>
-              </w:rPr>
-              <w:t>Декларации от продавач</w:t>
-            </w:r>
-            <w:r>
-              <w:rPr>
-                <w:rFonts w:ascii="Georgia" w:hAnsi="Georgia"/>
-                <w:sz w:val="21"/>
-                <w:szCs w:val="21"/>
-                <w:lang w:val="bg-BG" w:eastAsia="bg-BG"/>
-              </w:rPr>
-              <w:t>а</w:t>
-            </w:r>
-            <w:r>
-              <w:rPr>
-                <w:rFonts w:ascii="Georgia" w:hAnsi="Georgia"/>
-                <w:sz w:val="21"/>
-                <w:szCs w:val="21"/>
-                <w:lang w:val="bg-BG" w:eastAsia="bg-BG"/>
-              </w:rPr>
-              <w:t xml:space="preserve">; </w:t>
-            </w:r>
-            <w:r>
-              <w:rPr>
-                <w:rFonts w:ascii="Georgia" w:hAnsi="Georgia"/>
-                <w:b/>
-                <w:sz w:val="21"/>
-                <w:szCs w:val="21"/>
-                <w:lang w:val="bg-BG" w:eastAsia="bg-BG"/>
-              </w:rPr>
-              <w:t>1</w:t>
-            </w:r>
-            <w:r>
-              <w:rPr>
-                <w:rFonts w:ascii="Georgia" w:hAnsi="Georgia"/>
-                <w:b/>
-                <w:sz w:val="21"/>
-                <w:szCs w:val="21"/>
-                <w:lang w:val="bg-BG" w:eastAsia="bg-BG"/>
-              </w:rPr>
-              <w:t>1</w:t>
-            </w:r>
-            <w:r>
-              <w:rPr>
-                <w:rFonts w:ascii="Georgia" w:hAnsi="Georgia"/>
-                <w:b/>
-                <w:sz w:val="21"/>
-                <w:szCs w:val="21"/>
-                <w:lang w:val="bg-BG" w:eastAsia="bg-BG"/>
-              </w:rPr>
-              <w:t>.</w:t>
-            </w:r>
-            <w:r>
-              <w:rPr>
-                <w:rFonts w:ascii="Georgia" w:hAnsi="Georgia"/>
-                <w:sz w:val="21"/>
-                <w:szCs w:val="21"/>
-                <w:lang w:val="bg-BG" w:eastAsia="bg-BG"/>
-              </w:rPr>
-              <w:t xml:space="preserve"> Декларации от купувача;</w:t>
-            </w:r>
-            <w:r>
-              <w:rPr>
-                <w:rFonts w:ascii="Georgia" w:hAnsi="Georgia"/>
-                <w:sz w:val="21"/>
-                <w:szCs w:val="21"/>
-                <w:lang w:val="bg-BG" w:eastAsia="bg-BG"/>
-              </w:rPr>
-              <w:t xml:space="preserve"> </w:t>
-            </w:r>
-            <w:r>
-              <w:rPr>
-                <w:rFonts w:ascii="Georgia" w:hAnsi="Georgia"/>
-                <w:b/>
-                <w:sz w:val="21"/>
-                <w:szCs w:val="21"/>
-                <w:lang w:val="bg-BG" w:eastAsia="bg-BG"/>
-              </w:rPr>
-              <w:t>1</w:t>
-            </w:r>
-            <w:r>
-              <w:rPr>
-                <w:rFonts w:ascii="Georgia" w:hAnsi="Georgia"/>
-                <w:b/>
-                <w:sz w:val="21"/>
-                <w:szCs w:val="21"/>
-                <w:lang w:val="bg-BG" w:eastAsia="bg-BG"/>
-              </w:rPr>
-              <w:t>2</w:t>
-            </w:r>
-            <w:r>
-              <w:rPr>
-                <w:rFonts w:ascii="Georgia" w:hAnsi="Georgia"/>
-                <w:b/>
-                <w:sz w:val="21"/>
-                <w:szCs w:val="21"/>
-                <w:lang w:val="bg-BG" w:eastAsia="bg-BG"/>
-              </w:rPr>
-              <w:t>.</w:t>
-            </w:r>
-            <w:r>
-              <w:rPr>
-                <w:rFonts w:ascii="Georgia" w:hAnsi="Georgia"/>
-                <w:sz w:val="21"/>
-                <w:szCs w:val="21"/>
-                <w:lang w:val="bg-BG" w:eastAsia="bg-BG"/>
-              </w:rPr>
-              <w:t xml:space="preserve"> </w:t>
-            </w:r>
-            <w:r>
-              <w:rPr>
-                <w:rFonts w:ascii="Georgia" w:hAnsi="Georgia"/>
-                <w:sz w:val="21"/>
-                <w:szCs w:val="21"/>
-                <w:lang w:val="bg-BG" w:eastAsia="bg-BG"/>
-              </w:rPr>
-              <w:t>Предварителен договор между същите страни от 24</w:t>
-            </w:r>
-            <w:r>
-              <w:rPr>
-                <w:rFonts w:ascii="Georgia" w:hAnsi="Georgia"/>
-                <w:sz w:val="21"/>
-                <w:szCs w:val="21"/>
-                <w:lang w:val="en-US" w:eastAsia="bg-BG"/>
-              </w:rPr>
-              <w:t>.</w:t>
-            </w:r>
-            <w:r>
-              <w:rPr>
-                <w:rFonts w:ascii="Georgia" w:hAnsi="Georgia"/>
-                <w:sz w:val="21"/>
-                <w:szCs w:val="21"/>
-                <w:lang w:val="bg-BG" w:eastAsia="bg-BG"/>
-              </w:rPr>
-              <w:t>02</w:t>
-            </w:r>
-            <w:r>
-              <w:rPr>
-                <w:rFonts w:ascii="Georgia" w:hAnsi="Georgia"/>
-                <w:sz w:val="21"/>
-                <w:szCs w:val="21"/>
-                <w:lang w:val="en-US" w:eastAsia="bg-BG"/>
-              </w:rPr>
-              <w:t xml:space="preserve">.2026 </w:t>
-            </w:r>
-            <w:r>
-              <w:rPr>
-                <w:rFonts w:ascii="Georgia" w:hAnsi="Georgia"/>
-                <w:sz w:val="21"/>
-                <w:szCs w:val="21"/>
-                <w:lang w:val="bg-BG" w:eastAsia="bg-BG"/>
-              </w:rPr>
-              <w:t>година и</w:t>
-            </w:r>
-            <w:r>
-              <w:rPr>
-                <w:rFonts w:ascii="Georgia" w:hAnsi="Georgia"/>
-                <w:sz w:val="21"/>
-                <w:szCs w:val="21"/>
-                <w:lang w:val="bg-BG" w:eastAsia="bg-BG"/>
-              </w:rPr>
-              <w:t xml:space="preserve"> Протокол – опис</w:t>
-            </w:r>
-            <w:r>
-              <w:rPr>
-                <w:rFonts w:ascii="Georgia" w:hAnsi="Georgia"/>
-                <w:sz w:val="21"/>
-                <w:szCs w:val="21"/>
-                <w:lang w:val="bg-BG" w:eastAsia="bg-BG"/>
-              </w:rPr>
-              <w:t xml:space="preserve"> към него от същата дата; </w:t>
-            </w:r>
-            <w:r>
-              <w:rPr>
-                <w:rFonts w:ascii="Georgia" w:hAnsi="Georgia"/>
-                <w:b/>
-                <w:sz w:val="21"/>
-                <w:szCs w:val="21"/>
-                <w:lang w:val="bg-BG" w:eastAsia="bg-BG"/>
-              </w:rPr>
-              <w:t>13.</w:t>
-            </w:r>
-            <w:r>
-              <w:rPr>
-                <w:rFonts w:ascii="Georgia" w:hAnsi="Georgia"/>
-                <w:sz w:val="21"/>
-                <w:szCs w:val="21"/>
-                <w:lang w:val="bg-BG" w:eastAsia="bg-BG"/>
-              </w:rPr>
-              <w:t xml:space="preserve"> Платежно нареждане за платено капаро в размер на 10% от продажната цена;</w:t>
-            </w:r>
-            <w:r>
-              <w:rPr>
-                <w:rFonts w:ascii="Georgia" w:hAnsi="Georgia"/>
-                <w:sz w:val="21"/>
-                <w:szCs w:val="21"/>
-                <w:lang w:val="bg-BG" w:eastAsia="bg-BG"/>
-              </w:rPr>
-              <w:t xml:space="preserve"> </w:t>
-            </w:r>
-            <w:r>
-              <w:rPr>
-                <w:rFonts w:ascii="Georgia" w:hAnsi="Georgia"/>
-                <w:b/>
-                <w:sz w:val="21"/>
-                <w:szCs w:val="21"/>
-                <w:lang w:val="bg-BG" w:eastAsia="bg-BG"/>
-              </w:rPr>
-              <w:t>14.</w:t>
-            </w:r>
-            <w:r>
-              <w:rPr>
-                <w:rFonts w:ascii="Georgia" w:hAnsi="Georgia"/>
-                <w:sz w:val="21"/>
-                <w:szCs w:val="21"/>
-                <w:lang w:val="bg-BG" w:eastAsia="bg-BG"/>
-              </w:rPr>
-              <w:t xml:space="preserve"> </w:t>
-            </w:r>
-            <w:r>
-              <w:rPr>
-                <w:rFonts w:ascii="Georgia" w:hAnsi="Georgia"/>
-                <w:sz w:val="21"/>
-                <w:szCs w:val="21"/>
-                <w:lang w:val="bg-BG" w:eastAsia="bg-BG"/>
-              </w:rPr>
-              <w:t xml:space="preserve">Платежно нареждане </w:t>
-            </w:r>
-            <w:r>
-              <w:rPr>
-                <w:rFonts w:ascii="Georgia" w:hAnsi="Georgia"/>
-                <w:sz w:val="21"/>
-                <w:szCs w:val="21"/>
-                <w:lang w:val="bg-BG" w:eastAsia="bg-BG"/>
-              </w:rPr>
-              <w:t>за платени такси. -----</w:t>
+                <w:lang w:eastAsia="bg-BG"/>
+              </w:rPr>
+              <w:t>{{presented_documents_text}}</w:t>
+            </w:r>
+            <w:r>
+              <w:rPr>
+                <w:rFonts w:ascii="Georgia" w:hAnsi="Georgia"/>
+                <w:sz w:val="21"/>
+                <w:szCs w:val="21"/>
+                <w:lang w:val="bg-BG" w:eastAsia="bg-BG"/>
+              </w:rPr>
+              <w:t xml:space="preserve"> -----</w:t>
             </w:r>
             <w:r>
               <w:rPr>

</xml_diff>

<commit_message>
Finalize DOCX template to match legal document structure and placeholders
</commit_message>
<xml_diff>
--- a/templates/notarial-act-template-v1.docx
+++ b/templates/notarial-act-template-v1.docx
@@ -1910,16 +1910,7 @@
                 <w:szCs w:val="21"/>
                 <w:lang w:eastAsia="bg-BG"/>
               </w:rPr>
-              <w:t>{{cadastral_description_block}}</w:t>
-            </w:r>
-            <w:r>
-              <w:rPr>
-                <w:rFonts w:ascii="Georgia" w:eastAsia="Calibri" w:hAnsi="Georgia"/>
-                <w:sz w:val="21"/>
-                <w:szCs w:val="21"/>
-                <w:lang w:eastAsia="bg-BG"/>
-              </w:rPr>
-              <w:t>,</w:t>
+              <w:t>- ЖИЛИЩЕ, АПАРТАМЕНТ – в жилищна или вилна сграда, или в сграда със смесено предназначение, който съгласно Схема на самостоятелен обект в сграда № {{pdf_data.scheme_number}}, издадена от АГКК, представлява Самостоятелен обект в сграда с идентификатор {{pdf_data.property_identifier}} ({{pdf_data.property_identifier_words}}), по кадастралната карта и кадастралните регистри на гр. София, община Столична, област София (столица), одобрени със Заповед № {{pdf_data.cadastral_order}} на {{pdf_data.cadastral_order_issuer}}, последно изменение на кадастралната карта и кадастралните регистри, засягащо самостоятелния обект: {{pdf_data.last_cadastral_change}},</w:t>
             </w:r>
             <w:r>
               <w:rPr>
@@ -1935,9 +1926,18 @@
                 <w:rFonts w:ascii="Georgia" w:eastAsia="Calibri" w:hAnsi="Georgia"/>
                 <w:sz w:val="21"/>
                 <w:szCs w:val="21"/>
-                <w:lang w:eastAsia="bg-BG"/>
-              </w:rPr>
-              <w:t>{{ownership_proof_text}}</w:t>
+                <w:lang w:val="bg-BG" w:eastAsia="bg-BG"/>
+              </w:rPr>
+              <w:t xml:space="preserve">с адрес на самостоятелния обект: {{pdf_data.property_address_formatted}}, самостоятелният обект се намира на етаж {{pdf_data.property_floor}} ({{pdf_data.property_floor_words}}) в сграда с идентификатор {{pdf_data.building_identifier}} ({{pdf_data.building_identifier_words}}), с предназначение: {{pdf_data.building_purpose}}, брой етажи – {{pdf_data.building_floors}} ({{pdf_data.building_floors_words}}), </w:t>
+            </w:r>
+            <w:r>
+              <w:rPr>
+                <w:rFonts w:ascii="Georgia" w:eastAsia="Calibri" w:hAnsi="Georgia"/>
+                <w:sz w:val="21"/>
+                <w:szCs w:val="21"/>
+                <w:lang w:eastAsia="bg-BG"/>
+              </w:rPr>
+              <w:t>сградата е разположена в поземлен имот с идентификатор {{pdf_data.parcel_identifier}} ({{pdf_data.parcel_identifier_words}}), с предназначение на самостоятелния обект – {{pdf_data.property_purpose}}, брой нива на обекта: {{pdf_data.property_levels}} ({{pdf_data.property_levels_words}}), площ на самостоятелния обект – {{pdf_data.property_area}} кв.м. ({{pdf_data.property_area_words}}), и прилежащи части: {{pdf_data.attached_parts_formatted}}, ниво: {{pdf_data.property_levels}} ({{pdf_data.property_levels_words}}), при съседи на самостоятелния обект: на същия етаж – самостоятелен обект с идентификатор {{pdf_data.neighbors.same_floor}} ({{pdf_data.neighbors.same_floor_words}}), под обекта – самостоятелен обект с идентификатор {{pdf_data.neighbors.below}} ({{pdf_data.neighbors.below_words}}), над обекта – самостоятелен обект с идентификатор {{pdf_data.neighbors.above}} ({{pdf_data.neighbors.above_words}}), {{ownership_proof_text}},</w:t>
             </w:r>
             <w:r>
               <w:rPr>
@@ -1947,7 +1947,7 @@
                 <w:szCs w:val="21"/>
                 <w:lang w:val="bg-BG"/>
               </w:rPr>
-              <w:t xml:space="preserve">, </w:t>
+              <w:t xml:space="preserve"> </w:t>
             </w:r>
             <w:r>
               <w:rPr>
@@ -2156,11 +2156,31 @@
                 <w:szCs w:val="21"/>
                 <w:lang w:val="bg-BG" w:eastAsia="bg-BG"/>
               </w:rPr>
-              <w:t xml:space="preserve">купувача </w:t>
+              <w:t>купувач</w:t>
             </w:r>
             <w:r>
               <w:rPr>
                 <w:rFonts w:ascii="Georgia" w:hAnsi="Georgia" w:cs="Georgia"/>
+                <w:spacing w:val="-2"/>
+                <w:sz w:val="21"/>
+                <w:szCs w:val="21"/>
+                <w:lang w:val="bg-BG" w:eastAsia="bg-BG"/>
+              </w:rPr>
+              <w:t>ът</w:t>
+            </w:r>
+            <w:r>
+              <w:rPr>
+                <w:rFonts w:ascii="Georgia" w:hAnsi="Georgia" w:cs="Georgia"/>
+                <w:spacing w:val="-2"/>
+                <w:sz w:val="21"/>
+                <w:szCs w:val="21"/>
+                <w:lang w:val="bg-BG" w:eastAsia="bg-BG"/>
+              </w:rPr>
+              <w:t xml:space="preserve"> </w:t>
+            </w:r>
+            <w:r>
+              <w:rPr>
+                <w:rFonts w:ascii="Georgia" w:hAnsi="Georgia" w:cs="Georgia"/>
                 <w:b/>
                 <w:bCs/>
                 <w:sz w:val="21"/>
@@ -2194,7 +2214,17 @@
                 <w:szCs w:val="21"/>
                 <w:lang w:val="bg-BG" w:eastAsia="bg-BG"/>
               </w:rPr>
-              <w:t xml:space="preserve">, че по отношение на недвижимия имот по т. 1 от настоящия нотариален акт са подписали </w:t>
+              <w:t xml:space="preserve">, че по </w:t>
+            </w:r>
+            <w:r>
+              <w:rPr>
+                <w:rFonts w:ascii="Georgia" w:hAnsi="Georgia"/>
+                <w:sz w:val="21"/>
+                <w:szCs w:val="21"/>
+                <w:lang w:val="bg-BG" w:eastAsia="bg-BG"/>
+              </w:rPr>
+              <w:lastRenderedPageBreak/>
+              <w:t xml:space="preserve">отношение на недвижимия имот по т. 1 от настоящия нотариален акт са подписали </w:t>
             </w:r>
             <w:r>
               <w:rPr>
@@ -2359,7 +2389,7 @@
                 <w:szCs w:val="21"/>
                 <w:lang w:eastAsia="bg-BG"/>
               </w:rPr>
-              <w:t>{{formatted_deposit_percent}}</w:t>
+              <w:t>{{deposit_percent_formatted}}</w:t>
             </w:r>
             <w:r>
               <w:rPr>
@@ -2368,7 +2398,25 @@
                 <w:szCs w:val="21"/>
                 <w:lang w:val="bg-BG" w:eastAsia="bg-BG"/>
               </w:rPr>
-              <w:t xml:space="preserve"> (десет процента) от договорената </w:t>
+              <w:t xml:space="preserve"> </w:t>
+            </w:r>
+            <w:r>
+              <w:rPr>
+                <w:rFonts w:ascii="Georgia" w:hAnsi="Georgia" w:cs="Courier New"/>
+                <w:sz w:val="21"/>
+                <w:szCs w:val="21"/>
+                <w:lang w:val="bg-BG" w:eastAsia="bg-BG"/>
+              </w:rPr>
+              <w:t>({{deposit_percent_words}})</w:t>
+            </w:r>
+            <w:r>
+              <w:rPr>
+                <w:rFonts w:ascii="Georgia" w:hAnsi="Georgia" w:cs="Courier New"/>
+                <w:sz w:val="21"/>
+                <w:szCs w:val="21"/>
+                <w:lang w:val="bg-BG" w:eastAsia="bg-BG"/>
+              </w:rPr>
+              <w:t xml:space="preserve"> от договорената </w:t>
             </w:r>
             <w:r>
               <w:rPr>
@@ -3005,7 +3053,7 @@
                 <w:szCs w:val="21"/>
                 <w:lang w:eastAsia="bg-BG"/>
               </w:rPr>
-              <w:t>{{tax_evaluation_words}}</w:t>
+              <w:t>{{tax_evaluation_amount_words}}</w:t>
             </w:r>
             <w:r>
               <w:rPr>
@@ -3317,17 +3365,7 @@
                 <w:szCs w:val="21"/>
                 <w:lang w:val="bg-BG" w:eastAsia="bg-BG"/>
               </w:rPr>
-              <w:t xml:space="preserve"> обременен с вещни тежести, ипотечни </w:t>
-            </w:r>
-            <w:r>
-              <w:rPr>
-                <w:rFonts w:ascii="Georgia" w:hAnsi="Georgia"/>
-                <w:sz w:val="21"/>
-                <w:szCs w:val="21"/>
-                <w:lang w:val="bg-BG" w:eastAsia="bg-BG"/>
-              </w:rPr>
-              <w:lastRenderedPageBreak/>
-              <w:t>задължения и възбрани, за имот</w:t>
+              <w:t xml:space="preserve"> обременен с вещни тежести, ипотечни задължения и възбрани, за имот</w:t>
             </w:r>
             <w:r>
               <w:rPr>
@@ -3700,25 +3738,7 @@
                 <w:szCs w:val="21"/>
                 <w:lang w:val="en-US" w:eastAsia="bg-BG"/>
               </w:rPr>
-              <w:t>{{formatted_deposit_percent}}</w:t>
-            </w:r>
-            <w:r>
-              <w:rPr>
-                <w:rFonts w:ascii="Georgia" w:hAnsi="Georgia"/>
-                <w:sz w:val="21"/>
-                <w:szCs w:val="21"/>
-                <w:lang w:val="bg-BG" w:eastAsia="bg-BG"/>
-              </w:rPr>
-              <w:t xml:space="preserve"> (</w:t>
-            </w:r>
-            <w:r>
-              <w:rPr>
-                <w:rFonts w:ascii="Georgia" w:hAnsi="Georgia"/>
-                <w:sz w:val="21"/>
-                <w:szCs w:val="21"/>
-                <w:lang w:val="bg-BG" w:eastAsia="bg-BG"/>
-              </w:rPr>
-              <w:t>десет</w:t>
+              <w:t>{{deposit_percent_formatted}}</w:t>
             </w:r>
             <w:r>
               <w:rPr>
@@ -3736,7 +3756,7 @@
                 <w:szCs w:val="21"/>
                 <w:lang w:val="bg-BG" w:eastAsia="bg-BG"/>
               </w:rPr>
-              <w:t>процента)</w:t>
+              <w:t>({{deposit_percent_words}})</w:t>
             </w:r>
             <w:r>
               <w:rPr>
@@ -4731,6 +4751,7 @@
                 <w:szCs w:val="21"/>
                 <w:lang w:val="bg-BG" w:eastAsia="bg-BG"/>
               </w:rPr>
+              <w:lastRenderedPageBreak/>
               <w:t xml:space="preserve">           </w:t>
             </w:r>
             <w:r>

</xml_diff>